<commit_message>
docs: 填入 GitHub 仓库链接
</commit_message>
<xml_diff>
--- a/实验报告.docx
+++ b/实验报告.docx
@@ -4228,7 +4228,7 @@
           <w:i w:val="0"/>
           <w:sz w:val="24"/>
         </w:rPr>
-        <w:t>本地仓库方面，已使用 GitHub Copilot 自带的 Git 2.56.0 在提交文件夹内完成 git init，并建立 7 条提交（含真实提交哈希，详见 GIT_COMMIT_RECORD.md）；仅剩“推送到 GitHub”需使用本人账号完成。两个课后项目的任务清单见“课后任务清单.md”，分别列出差异表达分析与医疗对话整理两个 Skill 的任务、验收标准与提交物。</w:t>
+        <w:t>本地仓库方面，已使用 GitHub Copilot 自带的 Git 2.56.0 在提交文件夹内完成 git init、建立 7 条提交，并成功推送到 GitHub 仓库（含真实提交哈希，详见 GIT_COMMIT_RECORD.md）。两个课后项目的任务清单见“课后任务清单.md”，分别列出差异表达分析与医疗对话整理两个 Skill 的任务、验收标准与提交物。</w:t>
       </w:r>
     </w:p>
     <w:p>
@@ -4243,7 +4243,7 @@
           <w:i w:val="0"/>
           <w:sz w:val="24"/>
         </w:rPr>
-        <w:t>GitHub 仓库链接：________________________（发布后填写真实地址）。</w:t>
+        <w:t>GitHub 仓库链接：https://github.com/18sama/2024187007-agent-lab</w:t>
       </w:r>
     </w:p>
     <w:p>

</xml_diff>